<commit_message>
fix(export): resolve latin-1 header UnicodeEncodeError for Vietnamese docx filenames and clean UI
</commit_message>
<xml_diff>
--- a/templates/VídụvềquytrìnhkiểmtrahệthốngAICameraGiámsátgiaothông.docx
+++ b/templates/VídụvềquytrìnhkiểmtrahệthốngAICameraGiámsátgiaothông.docx
@@ -55,7 +55,41 @@
           <w:sz w:val="24"/>
           <w:szCs w:val="24"/>
         </w:rPr>
-        <w:t>{{nội dung thiết lập}}</w:t>
+        <w:t>{{</w:t>
+      </w:r>
+      <w:r>
+        <w:rPr>
+          <w:rFonts w:ascii="Times New Roman" w:eastAsia="Times New Roman" w:hAnsi="Times New Roman" w:cs="Times New Roman"/>
+          <w:sz w:val="24"/>
+          <w:szCs w:val="24"/>
+        </w:rPr>
+        <w:t xml:space="preserve"> </w:t>
+      </w:r>
+      <w:r>
+        <w:rPr>
+          <w:rFonts w:ascii="Times New Roman" w:eastAsia="Times New Roman" w:hAnsi="Times New Roman" w:cs="Times New Roman"/>
+          <w:sz w:val="24"/>
+          <w:szCs w:val="24"/>
+        </w:rPr>
+        <w:t>nội dung thiết lập</w:t>
+      </w:r>
+      <w:r>
+        <w:rPr>
+          <w:rFonts w:ascii="Times New Roman" w:eastAsia="Times New Roman" w:hAnsi="Times New Roman" w:cs="Times New Roman"/>
+          <w:sz w:val="24"/>
+          <w:szCs w:val="24"/>
+        </w:rPr>
+        <w:t xml:space="preserve"> </w:t>
+      </w:r>
+      <w:bookmarkStart w:id="0" w:name="_GoBack"/>
+      <w:bookmarkEnd w:id="0"/>
+      <w:r>
+        <w:rPr>
+          <w:rFonts w:ascii="Times New Roman" w:eastAsia="Times New Roman" w:hAnsi="Times New Roman" w:cs="Times New Roman"/>
+          <w:sz w:val="24"/>
+          <w:szCs w:val="24"/>
+        </w:rPr>
+        <w:t>}}</w:t>
       </w:r>
     </w:p>
     <w:p>
@@ -118,12 +152,7 @@
         </w:numPr>
       </w:pPr>
       <w:r>
-        <w:t>{{Phát triển mô hình</w:t>
-      </w:r>
-      <w:bookmarkStart w:id="0" w:name="_GoBack"/>
-      <w:bookmarkEnd w:id="0"/>
-      <w:r>
-        <w:t>}}</w:t>
+        <w:t>{{Phát triển mô hình}}</w:t>
       </w:r>
     </w:p>
     <w:p>

</xml_diff>